<commit_message>
feat(connector): 添加模型 Provider 支持并统一 HTTP 请求解析
新增多模型 Provider 适配器抽象层，支持 OpenAI、DeepSeek、Anthropic、Gemini、Ollama 和自定义 HTTP 连接器。冻结 Provider 类型、模型参数和响应模式至不可变快照，前端支持按 Provider 类型动态切换配置表单。
</commit_message>
<xml_diff>
--- a/docs/计划修订_20260714/revised-docx/01-基础配置与Agent管理计划-V1.1-二次实施增补.docx
+++ b/docs/计划修订_20260714/revised-docx/01-基础配置与Agent管理计划-V1.1-二次实施增补.docx
@@ -17,6 +17,14 @@
           <w:szCs w:val="44"/>
         </w:rPr>
         <w:t>01 基础配置与 Agent 管理实施计划</w:t>
+      </w:r>
+    </w:p>
+    <w:p>
+      <w:pPr>
+        <w:pStyle w:val="Normal"/>
+      </w:pPr>
+      <w:r>
+        <w:t>修订提示：本文新增第 11 章 HTTP Connector 模型协议化前向增补；文件版本号和名称保持不变。</w:t>
       </w:r>
     </w:p>
     <w:p>
@@ -2236,6 +2244,282 @@
       </w:pPr>
       <w:r>
         <w:t xml:space="preserve">模块 01 只有在原三类配置真实环境验收通过、机器人两种入口模式可配置、授权 Agent 解析可供模块 02/04 使用、长连接事件可可靠移交且现有 DIRECT_AGENT 回归通过后，才视为对协作流水线初版就绪。</w:t>
+      </w:r>
+    </w:p>
+    <w:p>
+      <w:pPr>
+        <w:pStyle w:val="Heading1"/>
+      </w:pPr>
+      <w:r>
+        <w:t>11. HTTP Connector 模型协议化前向增补</w:t>
+      </w:r>
+    </w:p>
+    <w:p>
+      <w:pPr>
+        <w:spacing w:before="1800" w:after="480"/>
+        <w:jc w:val="center"/>
+        <w:keepNext/>
+      </w:pPr>
+      <w:pPr/>
+      <w:r>
+        <w:t>本章是 REQ-HTTP-MODEL-20260810 的前向实施契约。保留现有 Agent、Pipeline、飞书、Result 1.1、密钥加密和权限边界；若与第 1 至 10 章的旧 HTTP Connector 描述冲突，以本章为准。</w:t>
+      </w:r>
+    </w:p>
+    <w:p>
+      <w:pPr>
+        <w:pStyle w:val="Heading2"/>
+      </w:pPr>
+      <w:r>
+        <w:t>11.1 Provider 与数据模型</w:t>
+      </w:r>
+    </w:p>
+    <w:p>
+      <w:pPr>
+        <w:spacing w:before="1800" w:after="480"/>
+        <w:jc w:val="center"/>
+        <w:keepNext/>
+      </w:pPr>
+      <w:pPr/>
+      <w:r>
+        <w:t>• 新增 OPENAI_COMPATIBLE、DEEPSEEK、ANTHROPIC、GEMINI、OLLAMA、CUSTOM 六类 providerType；旧记录默认 CUSTOM。</w:t>
+      </w:r>
+    </w:p>
+    <w:p>
+      <w:pPr>
+        <w:spacing w:before="1800" w:after="480"/>
+        <w:jc w:val="center"/>
+        <w:keepNext/>
+      </w:pPr>
+      <w:pPr/>
+      <w:r>
+        <w:t>• 通过 V3.9.3_7 前向迁移增加 provider_type、model_name、model_options、model_response_mode，并同步 fresh-install SQL；禁止修改 _1 至 _6。</w:t>
+      </w:r>
+    </w:p>
+    <w:p>
+      <w:pPr>
+        <w:spacing w:before="1800" w:after="480"/>
+        <w:jc w:val="center"/>
+        <w:keepNext/>
+      </w:pPr>
+      <w:pPr/>
+      <w:r>
+        <w:t>• Custom 继续使用 LEGACY 或 1.1；模型 Provider 后端固定 resultContractVersion=1.1，禁止保存 Legacy responseMapping。</w:t>
+      </w:r>
+    </w:p>
+    <w:p>
+      <w:pPr>
+        <w:spacing w:before="1800" w:after="480"/>
+        <w:jc w:val="center"/>
+        <w:keepNext/>
+      </w:pPr>
+      <w:pPr/>
+      <w:r>
+        <w:t>• 模型 Provider 必须填写 modelName。modelOptions 仅允许 temperature 0 至 2、topP 0 至 1、maxTokens 1 至 65536，未知字段拒绝。</w:t>
+      </w:r>
+    </w:p>
+    <w:p>
+      <w:pPr>
+        <w:pStyle w:val="Heading2"/>
+      </w:pPr>
+      <w:r>
+        <w:t>11.2 官方预设与鉴权</w:t>
+      </w:r>
+    </w:p>
+    <w:p>
+      <w:pPr>
+        <w:spacing w:before="1800" w:after="480"/>
+        <w:jc w:val="center"/>
+        <w:keepNext/>
+      </w:pPr>
+      <w:pPr/>
+      <w:r>
+        <w:t>• OpenAI-compatible 默认 https://api.openai.com、/v1/chat/completions、Bearer；DeepSeek 默认 https://api.deepseek.com、/chat/completions、Bearer。</w:t>
+      </w:r>
+    </w:p>
+    <w:p>
+      <w:pPr>
+        <w:spacing w:before="1800" w:after="480"/>
+        <w:jc w:val="center"/>
+        <w:keepNext/>
+      </w:pPr>
+      <w:pPr/>
+      <w:r>
+        <w:t>• Anthropic 默认 https://api.anthropic.com、/v1/messages、x-api-key，并带 anthropic-version: 2023-06-01。</w:t>
+      </w:r>
+    </w:p>
+    <w:p>
+      <w:pPr>
+        <w:spacing w:before="1800" w:after="480"/>
+        <w:jc w:val="center"/>
+        <w:keepNext/>
+      </w:pPr>
+      <w:pPr/>
+      <w:r>
+        <w:t>• Gemini 默认 https://generativelanguage.googleapis.com、/v1beta/models/{model}:generateContent、x-goog-api-key；{model} 只允许固定槽位。</w:t>
+      </w:r>
+    </w:p>
+    <w:p>
+      <w:pPr>
+        <w:spacing w:before="1800" w:after="480"/>
+        <w:jc w:val="center"/>
+        <w:keepNext/>
+      </w:pPr>
+      <w:pPr/>
+      <w:r>
+        <w:t>• Ollama 默认 http://127.0.0.1:11434、/api/chat、NONE；生产必须显式把本地主机加入 allowlist。</w:t>
+      </w:r>
+    </w:p>
+    <w:p>
+      <w:pPr>
+        <w:pStyle w:val="Heading2"/>
+      </w:pPr>
+      <w:r>
+        <w:t>11.3 统一调用和安全</w:t>
+      </w:r>
+    </w:p>
+    <w:p>
+      <w:pPr>
+        <w:spacing w:before="1800" w:after="480"/>
+        <w:jc w:val="center"/>
+        <w:keepNext/>
+      </w:pPr>
+      <w:pPr/>
+      <w:r>
+        <w:t>• Connector 测试、Agent 测试和正式 Gateway 共用统一 Connector 调用服务、Provider Adapter 和公共 HTTP Transport。</w:t>
+      </w:r>
+    </w:p>
+    <w:p>
+      <w:pPr>
+        <w:spacing w:before="1800" w:after="480"/>
+        <w:jc w:val="center"/>
+        <w:keepNext/>
+      </w:pPr>
+      <w:pPr/>
+      <w:r>
+        <w:t>• 公共 Transport 统一执行 HTTP/HTTPS、Host allowlist、DNS 私网地址、无重定向、超时、1 MiB 请求/响应上限、Header 校验、凭据解密和脱敏；allowlist 为空时所有真实调用 fail closed。</w:t>
+      </w:r>
+    </w:p>
+    <w:p>
+      <w:pPr>
+        <w:spacing w:before="1800" w:after="480"/>
+        <w:jc w:val="center"/>
+        <w:keepNext/>
+      </w:pPr>
+      <w:pPr/>
+      <w:r>
+        <w:t>• 快照保存 Provider、模型、非敏感连接配置和参数，不保存密钥、敏感 Header、原始响应或完整调用日志。</w:t>
+      </w:r>
+    </w:p>
+    <w:p>
+      <w:pPr>
+        <w:pStyle w:val="Heading2"/>
+      </w:pPr>
+      <w:r>
+        <w:t>11.4 输入与结果</w:t>
+      </w:r>
+    </w:p>
+    <w:p>
+      <w:pPr>
+        <w:spacing w:before="1800" w:after="480"/>
+        <w:jc w:val="center"/>
+        <w:keepNext/>
+      </w:pPr>
+      <w:pPr/>
+      <w:r>
+        <w:t>• input.prompt 为字符串时作为用户消息，否则稳定 JSON 序列化整个 input；resumeInput 和 artifactInputs 以独立标记 JSON 段追加，不抓取 Artifact URI。</w:t>
+      </w:r>
+    </w:p>
+    <w:p>
+      <w:pPr>
+        <w:spacing w:before="1800" w:after="480"/>
+        <w:jc w:val="center"/>
+        <w:keepNext/>
+      </w:pPr>
+      <w:pPr/>
+      <w:r>
+        <w:t>• TEXT 转为仅 SUCCESS 的 AgentResultContract，needsUser=false、retryable=false、output={text}，空文本返回 MODEL_RESPONSE_EMPTY。</w:t>
+      </w:r>
+    </w:p>
+    <w:p>
+      <w:pPr>
+        <w:spacing w:before="1800" w:after="480"/>
+        <w:jc w:val="center"/>
+        <w:keepNext/>
+      </w:pPr>
+      <w:pPr/>
+      <w:r>
+        <w:t>• RESULT_1_1 严格解析模型文本并执行 AgentResultValidator；OpenAI/DeepSeek、Gemini、Ollama启用原生 JSON 参数，Anthropic 使用系统提示约束。</w:t>
+      </w:r>
+    </w:p>
+    <w:p>
+      <w:pPr>
+        <w:pStyle w:val="Heading2"/>
+      </w:pPr>
+      <w:r>
+        <w:t>11.5 页面与易用性</w:t>
+      </w:r>
+    </w:p>
+    <w:p>
+      <w:pPr>
+        <w:spacing w:before="1800" w:after="480"/>
+        <w:jc w:val="center"/>
+        <w:keepNext/>
+      </w:pPr>
+      <w:pPr/>
+      <w:r>
+        <w:t>• 页面名称改为“模型 Connector”，菜单路径和权限不变；表单按基础信息、Provider/Model、连接凭据、生成参数、Result Mode、高级配置排列。</w:t>
+      </w:r>
+    </w:p>
+    <w:p>
+      <w:pPr>
+        <w:spacing w:before="1800" w:after="480"/>
+        <w:jc w:val="center"/>
+        <w:keepNext/>
+      </w:pPr>
+      <w:pPr/>
+      <w:r>
+        <w:t>• Provider 切换只替换空值或仍等于旧预设的字段；自定义值和已保存密钥保留并显示状态。高级参数默认收起。</w:t>
+      </w:r>
+    </w:p>
+    <w:p>
+      <w:pPr>
+        <w:spacing w:before="1800" w:after="480"/>
+        <w:jc w:val="center"/>
+        <w:keepNext/>
+      </w:pPr>
+      <w:pPr/>
+      <w:r>
+        <w:t>• 列表增加 Provider、Model Name、Result Mode；模型测试默认输入为 {"prompt":"你好"}。</w:t>
+      </w:r>
+    </w:p>
+    <w:p>
+      <w:pPr>
+        <w:pStyle w:val="Heading2"/>
+      </w:pPr>
+      <w:r>
+        <w:t>11.6 测试与完成标准</w:t>
+      </w:r>
+    </w:p>
+    <w:p>
+      <w:pPr>
+        <w:spacing w:before="1800" w:after="480"/>
+        <w:jc w:val="center"/>
+        <w:keepNext/>
+      </w:pPr>
+      <w:pPr/>
+      <w:r>
+        <w:t>• 覆盖六类 Provider 请求、鉴权、响应提取、结构化结果、超时、HTTP 错误、SSRF、大小限制、脱敏、旧数据和 Custom 回归。</w:t>
+      </w:r>
+    </w:p>
+    <w:p>
+      <w:pPr>
+        <w:spacing w:before="1800" w:after="480"/>
+        <w:jc w:val="center"/>
+        <w:keepNext/>
+      </w:pPr>
+      <w:pPr/>
+      <w:r>
+        <w:t>• 六类 Connector 均可创建、测试、启用和执行；测试与正式执行使用同一 Adapter；真实密钥、模型响应和完整系统提示词不进入日志或快照。</w:t>
       </w:r>
     </w:p>
     <w:sectPr>

</xml_diff>